<commit_message>
Add secure fillable intake forms
</commit_message>
<xml_diff>
--- a/starter_packs/document_heavy/Alix-AI/templates/intake_estate_planning/template.docx
+++ b/starter_packs/document_heavy/Alix-AI/templates/intake_estate_planning/template.docx
@@ -135,24 +135,38 @@
       </w:r>
     </w:p>
     <w:p>
-      <w:r>
-        <w:rPr>
-          <w:b w:val="0"/>
-          <w:i w:val="0"/>
-          <w:sz w:val="22"/>
-        </w:rPr>
-        <w:t>__________________________________________________________________________________________</w:t>
-      </w:r>
+      <w:sdt>
+        <w:sdtPr>
+          <w:alias w:val="Q1: Which documents are you interested in? (Last Will and Testament / Revocable Living Trust / Deed transfer / Not sure — describe your goals)"/>
+          <w:tag w:val="q1_1"/>
+          <w:id w:val="1"/>
+          <w:showingPlcHdr/>
+          <w:text/>
+        </w:sdtPr>
+        <w:sdtEndPr/>
+        <w:sdtContent>
+          <w:r>
+            <w:t xml:space="preserve"/>
+          </w:r>
+        </w:sdtContent>
+      </w:sdt>
     </w:p>
     <w:p>
-      <w:r>
-        <w:rPr>
-          <w:b w:val="0"/>
-          <w:i w:val="0"/>
-          <w:sz w:val="22"/>
-        </w:rPr>
-        <w:t>__________________________________________________________________________________________</w:t>
-      </w:r>
+      <w:sdt>
+        <w:sdtPr>
+          <w:alias w:val="Q1 (line 2): Which documents are you interested in? (Last Will and Testament / Revocable Living Trust / Deed transfer / Not sure — describe your goals)"/>
+          <w:tag w:val="q1_2"/>
+          <w:id w:val="2"/>
+          <w:showingPlcHdr/>
+          <w:text/>
+        </w:sdtPr>
+        <w:sdtEndPr/>
+        <w:sdtContent>
+          <w:r>
+            <w:t xml:space="preserve"/>
+          </w:r>
+        </w:sdtContent>
+      </w:sdt>
     </w:p>
     <w:p>
       <w:r>
@@ -184,14 +198,21 @@
       </w:r>
     </w:p>
     <w:p>
-      <w:r>
-        <w:rPr>
-          <w:b w:val="0"/>
-          <w:i w:val="0"/>
-          <w:sz w:val="22"/>
-        </w:rPr>
-        <w:t>__________________________________________________________________________________________</w:t>
-      </w:r>
+      <w:sdt>
+        <w:sdtPr>
+          <w:alias w:val="Q2: Your full legal name, date of birth, and current address:"/>
+          <w:tag w:val="q2_1"/>
+          <w:id w:val="3"/>
+          <w:showingPlcHdr/>
+          <w:text/>
+        </w:sdtPr>
+        <w:sdtEndPr/>
+        <w:sdtContent>
+          <w:r>
+            <w:t xml:space="preserve"/>
+          </w:r>
+        </w:sdtContent>
+      </w:sdt>
     </w:p>
     <w:p>
       <w:r>
@@ -213,14 +234,21 @@
       </w:r>
     </w:p>
     <w:p>
-      <w:r>
-        <w:rPr>
-          <w:b w:val="0"/>
-          <w:i w:val="0"/>
-          <w:sz w:val="22"/>
-        </w:rPr>
-        <w:t>__________________________________________________________________________________________</w:t>
-      </w:r>
+      <w:sdt>
+        <w:sdtPr>
+          <w:alias w:val="Q3: Marital status, and spouse's full legal name if married:"/>
+          <w:tag w:val="q3_1"/>
+          <w:id w:val="4"/>
+          <w:showingPlcHdr/>
+          <w:text/>
+        </w:sdtPr>
+        <w:sdtEndPr/>
+        <w:sdtContent>
+          <w:r>
+            <w:t xml:space="preserve"/>
+          </w:r>
+        </w:sdtContent>
+      </w:sdt>
     </w:p>
     <w:p>
       <w:r>
@@ -242,34 +270,55 @@
       </w:r>
     </w:p>
     <w:p>
-      <w:r>
-        <w:rPr>
-          <w:b w:val="0"/>
-          <w:i w:val="0"/>
-          <w:sz w:val="22"/>
-        </w:rPr>
-        <w:t>__________________________________________________________________________________________</w:t>
-      </w:r>
+      <w:sdt>
+        <w:sdtPr>
+          <w:alias w:val="Q4: List each child (including from prior relationships), with date of birth:"/>
+          <w:tag w:val="q4_1"/>
+          <w:id w:val="5"/>
+          <w:showingPlcHdr/>
+          <w:text/>
+        </w:sdtPr>
+        <w:sdtEndPr/>
+        <w:sdtContent>
+          <w:r>
+            <w:t xml:space="preserve"/>
+          </w:r>
+        </w:sdtContent>
+      </w:sdt>
     </w:p>
     <w:p>
-      <w:r>
-        <w:rPr>
-          <w:b w:val="0"/>
-          <w:i w:val="0"/>
-          <w:sz w:val="22"/>
-        </w:rPr>
-        <w:t>__________________________________________________________________________________________</w:t>
-      </w:r>
+      <w:sdt>
+        <w:sdtPr>
+          <w:alias w:val="Q4 (line 2): List each child (including from prior relationships), with date of birth:"/>
+          <w:tag w:val="q4_2"/>
+          <w:id w:val="6"/>
+          <w:showingPlcHdr/>
+          <w:text/>
+        </w:sdtPr>
+        <w:sdtEndPr/>
+        <w:sdtContent>
+          <w:r>
+            <w:t xml:space="preserve"/>
+          </w:r>
+        </w:sdtContent>
+      </w:sdt>
     </w:p>
     <w:p>
-      <w:r>
-        <w:rPr>
-          <w:b w:val="0"/>
-          <w:i w:val="0"/>
-          <w:sz w:val="22"/>
-        </w:rPr>
-        <w:t>__________________________________________________________________________________________</w:t>
-      </w:r>
+      <w:sdt>
+        <w:sdtPr>
+          <w:alias w:val="Q4 (line 3): List each child (including from prior relationships), with date of birth:"/>
+          <w:tag w:val="q4_3"/>
+          <w:id w:val="7"/>
+          <w:showingPlcHdr/>
+          <w:text/>
+        </w:sdtPr>
+        <w:sdtEndPr/>
+        <w:sdtContent>
+          <w:r>
+            <w:t xml:space="preserve"/>
+          </w:r>
+        </w:sdtContent>
+      </w:sdt>
     </w:p>
     <w:p>
       <w:r>
@@ -301,24 +350,38 @@
       </w:r>
     </w:p>
     <w:p>
-      <w:r>
-        <w:rPr>
-          <w:b w:val="0"/>
-          <w:i w:val="0"/>
-          <w:sz w:val="22"/>
-        </w:rPr>
-        <w:t>__________________________________________________________________________________________</w:t>
-      </w:r>
+      <w:sdt>
+        <w:sdtPr>
+          <w:alias w:val="Q5: Real property you own (address, and whether it's your primary residence, and how title is currently held):"/>
+          <w:tag w:val="q5_1"/>
+          <w:id w:val="8"/>
+          <w:showingPlcHdr/>
+          <w:text/>
+        </w:sdtPr>
+        <w:sdtEndPr/>
+        <w:sdtContent>
+          <w:r>
+            <w:t xml:space="preserve"/>
+          </w:r>
+        </w:sdtContent>
+      </w:sdt>
     </w:p>
     <w:p>
-      <w:r>
-        <w:rPr>
-          <w:b w:val="0"/>
-          <w:i w:val="0"/>
-          <w:sz w:val="22"/>
-        </w:rPr>
-        <w:t>__________________________________________________________________________________________</w:t>
-      </w:r>
+      <w:sdt>
+        <w:sdtPr>
+          <w:alias w:val="Q5 (line 2): Real property you own (address, and whether it's your primary residence, and how title is currently held):"/>
+          <w:tag w:val="q5_2"/>
+          <w:id w:val="9"/>
+          <w:showingPlcHdr/>
+          <w:text/>
+        </w:sdtPr>
+        <w:sdtEndPr/>
+        <w:sdtContent>
+          <w:r>
+            <w:t xml:space="preserve"/>
+          </w:r>
+        </w:sdtContent>
+      </w:sdt>
     </w:p>
     <w:p>
       <w:r>
@@ -340,34 +403,55 @@
       </w:r>
     </w:p>
     <w:p>
-      <w:r>
-        <w:rPr>
-          <w:b w:val="0"/>
-          <w:i w:val="0"/>
-          <w:sz w:val="22"/>
-        </w:rPr>
-        <w:t>__________________________________________________________________________________________</w:t>
-      </w:r>
+      <w:sdt>
+        <w:sdtPr>
+          <w:alias w:val="Q6: Bank accounts, investment accounts, and retirement accounts (institution and approximate value; beneficiary already named, if any):"/>
+          <w:tag w:val="q6_1"/>
+          <w:id w:val="10"/>
+          <w:showingPlcHdr/>
+          <w:text/>
+        </w:sdtPr>
+        <w:sdtEndPr/>
+        <w:sdtContent>
+          <w:r>
+            <w:t xml:space="preserve"/>
+          </w:r>
+        </w:sdtContent>
+      </w:sdt>
     </w:p>
     <w:p>
-      <w:r>
-        <w:rPr>
-          <w:b w:val="0"/>
-          <w:i w:val="0"/>
-          <w:sz w:val="22"/>
-        </w:rPr>
-        <w:t>__________________________________________________________________________________________</w:t>
-      </w:r>
+      <w:sdt>
+        <w:sdtPr>
+          <w:alias w:val="Q6 (line 2): Bank accounts, investment accounts, and retirement accounts (institution and approximate value; beneficiary already named, if any):"/>
+          <w:tag w:val="q6_2"/>
+          <w:id w:val="11"/>
+          <w:showingPlcHdr/>
+          <w:text/>
+        </w:sdtPr>
+        <w:sdtEndPr/>
+        <w:sdtContent>
+          <w:r>
+            <w:t xml:space="preserve"/>
+          </w:r>
+        </w:sdtContent>
+      </w:sdt>
     </w:p>
     <w:p>
-      <w:r>
-        <w:rPr>
-          <w:b w:val="0"/>
-          <w:i w:val="0"/>
-          <w:sz w:val="22"/>
-        </w:rPr>
-        <w:t>__________________________________________________________________________________________</w:t>
-      </w:r>
+      <w:sdt>
+        <w:sdtPr>
+          <w:alias w:val="Q6 (line 3): Bank accounts, investment accounts, and retirement accounts (institution and approximate value; beneficiary already named, if any):"/>
+          <w:tag w:val="q6_3"/>
+          <w:id w:val="12"/>
+          <w:showingPlcHdr/>
+          <w:text/>
+        </w:sdtPr>
+        <w:sdtEndPr/>
+        <w:sdtContent>
+          <w:r>
+            <w:t xml:space="preserve"/>
+          </w:r>
+        </w:sdtContent>
+      </w:sdt>
     </w:p>
     <w:p>
       <w:r>
@@ -389,14 +473,21 @@
       </w:r>
     </w:p>
     <w:p>
-      <w:r>
-        <w:rPr>
-          <w:b w:val="0"/>
-          <w:i w:val="0"/>
-          <w:sz w:val="22"/>
-        </w:rPr>
-        <w:t>__________________________________________________________________________________________</w:t>
-      </w:r>
+      <w:sdt>
+        <w:sdtPr>
+          <w:alias w:val="Q7: Business interests, and approximate value of your total estate:"/>
+          <w:tag w:val="q7_1"/>
+          <w:id w:val="13"/>
+          <w:showingPlcHdr/>
+          <w:text/>
+        </w:sdtPr>
+        <w:sdtEndPr/>
+        <w:sdtContent>
+          <w:r>
+            <w:t xml:space="preserve"/>
+          </w:r>
+        </w:sdtContent>
+      </w:sdt>
     </w:p>
     <w:p>
       <w:r>
@@ -428,24 +519,38 @@
       </w:r>
     </w:p>
     <w:p>
-      <w:r>
-        <w:rPr>
-          <w:b w:val="0"/>
-          <w:i w:val="0"/>
-          <w:sz w:val="22"/>
-        </w:rPr>
-        <w:t>__________________________________________________________________________________________</w:t>
-      </w:r>
+      <w:sdt>
+        <w:sdtPr>
+          <w:alias w:val="Q8: Who do you want to inherit your assets, and in what shares or amounts?"/>
+          <w:tag w:val="q8_1"/>
+          <w:id w:val="14"/>
+          <w:showingPlcHdr/>
+          <w:text/>
+        </w:sdtPr>
+        <w:sdtEndPr/>
+        <w:sdtContent>
+          <w:r>
+            <w:t xml:space="preserve"/>
+          </w:r>
+        </w:sdtContent>
+      </w:sdt>
     </w:p>
     <w:p>
-      <w:r>
-        <w:rPr>
-          <w:b w:val="0"/>
-          <w:i w:val="0"/>
-          <w:sz w:val="22"/>
-        </w:rPr>
-        <w:t>__________________________________________________________________________________________</w:t>
-      </w:r>
+      <w:sdt>
+        <w:sdtPr>
+          <w:alias w:val="Q8 (line 2): Who do you want to inherit your assets, and in what shares or amounts?"/>
+          <w:tag w:val="q8_2"/>
+          <w:id w:val="15"/>
+          <w:showingPlcHdr/>
+          <w:text/>
+        </w:sdtPr>
+        <w:sdtEndPr/>
+        <w:sdtContent>
+          <w:r>
+            <w:t xml:space="preserve"/>
+          </w:r>
+        </w:sdtContent>
+      </w:sdt>
     </w:p>
     <w:p>
       <w:r>
@@ -467,14 +572,21 @@
       </w:r>
     </w:p>
     <w:p>
-      <w:r>
-        <w:rPr>
-          <w:b w:val="0"/>
-          <w:i w:val="0"/>
-          <w:sz w:val="22"/>
-        </w:rPr>
-        <w:t>__________________________________________________________________________________________</w:t>
-      </w:r>
+      <w:sdt>
+        <w:sdtPr>
+          <w:alias w:val="Q9: Who do you want to name as executor/personal representative (and an alternate)?"/>
+          <w:tag w:val="q9_1"/>
+          <w:id w:val="16"/>
+          <w:showingPlcHdr/>
+          <w:text/>
+        </w:sdtPr>
+        <w:sdtEndPr/>
+        <w:sdtContent>
+          <w:r>
+            <w:t xml:space="preserve"/>
+          </w:r>
+        </w:sdtContent>
+      </w:sdt>
     </w:p>
     <w:p>
       <w:r>
@@ -496,14 +608,21 @@
       </w:r>
     </w:p>
     <w:p>
-      <w:r>
-        <w:rPr>
-          <w:b w:val="0"/>
-          <w:i w:val="0"/>
-          <w:sz w:val="22"/>
-        </w:rPr>
-        <w:t>__________________________________________________________________________________________</w:t>
-      </w:r>
+      <w:sdt>
+        <w:sdtPr>
+          <w:alias w:val="Q10: If a trust is desired, who do you want to name as trustee (and a successor trustee)?"/>
+          <w:tag w:val="q10_1"/>
+          <w:id w:val="17"/>
+          <w:showingPlcHdr/>
+          <w:text/>
+        </w:sdtPr>
+        <w:sdtEndPr/>
+        <w:sdtContent>
+          <w:r>
+            <w:t xml:space="preserve"/>
+          </w:r>
+        </w:sdtContent>
+      </w:sdt>
     </w:p>
     <w:p>
       <w:r>
@@ -525,14 +644,21 @@
       </w:r>
     </w:p>
     <w:p>
-      <w:r>
-        <w:rPr>
-          <w:b w:val="0"/>
-          <w:i w:val="0"/>
-          <w:sz w:val="22"/>
-        </w:rPr>
-        <w:t>__________________________________________________________________________________________</w:t>
-      </w:r>
+      <w:sdt>
+        <w:sdtPr>
+          <w:alias w:val="Q11: If you have minor children, who do you want named as their guardian if both parents are unable to care for them?"/>
+          <w:tag w:val="q11_1"/>
+          <w:id w:val="18"/>
+          <w:showingPlcHdr/>
+          <w:text/>
+        </w:sdtPr>
+        <w:sdtEndPr/>
+        <w:sdtContent>
+          <w:r>
+            <w:t xml:space="preserve"/>
+          </w:r>
+        </w:sdtContent>
+      </w:sdt>
     </w:p>
     <w:p>
       <w:r>
@@ -554,14 +680,21 @@
       </w:r>
     </w:p>
     <w:p>
-      <w:r>
-        <w:rPr>
-          <w:b w:val="0"/>
-          <w:i w:val="0"/>
-          <w:sz w:val="22"/>
-        </w:rPr>
-        <w:t>__________________________________________________________________________________________</w:t>
-      </w:r>
+      <w:sdt>
+        <w:sdtPr>
+          <w:alias w:val="Q12: Do you want to name a healthcare surrogate and/or a power of attorney? If so, who?"/>
+          <w:tag w:val="q12_1"/>
+          <w:id w:val="19"/>
+          <w:showingPlcHdr/>
+          <w:text/>
+        </w:sdtPr>
+        <w:sdtEndPr/>
+        <w:sdtContent>
+          <w:r>
+            <w:t xml:space="preserve"/>
+          </w:r>
+        </w:sdtContent>
+      </w:sdt>
     </w:p>
     <w:p>
       <w:r>
@@ -583,24 +716,38 @@
       </w:r>
     </w:p>
     <w:p>
-      <w:r>
-        <w:rPr>
-          <w:b w:val="0"/>
-          <w:i w:val="0"/>
-          <w:sz w:val="22"/>
-        </w:rPr>
-        <w:t>__________________________________________________________________________________________</w:t>
-      </w:r>
+      <w:sdt>
+        <w:sdtPr>
+          <w:alias w:val="Q13: If a deed transfer is wanted: the property address, current owner(s) of record, and who the property should be transferred to:"/>
+          <w:tag w:val="q13_1"/>
+          <w:id w:val="20"/>
+          <w:showingPlcHdr/>
+          <w:text/>
+        </w:sdtPr>
+        <w:sdtEndPr/>
+        <w:sdtContent>
+          <w:r>
+            <w:t xml:space="preserve"/>
+          </w:r>
+        </w:sdtContent>
+      </w:sdt>
     </w:p>
     <w:p>
-      <w:r>
-        <w:rPr>
-          <w:b w:val="0"/>
-          <w:i w:val="0"/>
-          <w:sz w:val="22"/>
-        </w:rPr>
-        <w:t>__________________________________________________________________________________________</w:t>
-      </w:r>
+      <w:sdt>
+        <w:sdtPr>
+          <w:alias w:val="Q13 (line 2): If a deed transfer is wanted: the property address, current owner(s) of record, and who the property should be transferred to:"/>
+          <w:tag w:val="q13_2"/>
+          <w:id w:val="21"/>
+          <w:showingPlcHdr/>
+          <w:text/>
+        </w:sdtPr>
+        <w:sdtEndPr/>
+        <w:sdtContent>
+          <w:r>
+            <w:t xml:space="preserve"/>
+          </w:r>
+        </w:sdtContent>
+      </w:sdt>
     </w:p>
     <w:p>
       <w:r>

</xml_diff>